<commit_message>
atualiza CLAUDE.md com arquitetura completa IA-First e módulos Lego
</commit_message>
<xml_diff>
--- a/Atualizações funciolnalidade - V02.docx
+++ b/Atualizações funciolnalidade - V02.docx
@@ -8,15 +8,7 @@
         <w:t xml:space="preserve">1-) </w:t>
       </w:r>
       <w:r>
-        <w:t xml:space="preserve">Criar </w:t>
-      </w:r>
-      <w:proofErr w:type="spellStart"/>
-      <w:r>
-        <w:t>icone</w:t>
-      </w:r>
-      <w:proofErr w:type="spellEnd"/>
-      <w:r>
-        <w:t xml:space="preserve"> para o vendedor poder alterar a senha cria</w:t>
+        <w:t>Criar icone para o vendedor poder alterar a senha cria</w:t>
       </w:r>
       <w:r>
         <w:t>da</w:t>
@@ -30,23 +22,7 @@
         <w:t xml:space="preserve">2-) </w:t>
       </w:r>
       <w:r>
-        <w:t xml:space="preserve">Na funcionalidade produtos – </w:t>
-      </w:r>
-      <w:proofErr w:type="spellStart"/>
-      <w:r>
-        <w:t>Servi;os</w:t>
-      </w:r>
-      <w:proofErr w:type="spellEnd"/>
-      <w:r>
-        <w:t xml:space="preserve"> – quando editar trazer as </w:t>
-      </w:r>
-      <w:proofErr w:type="spellStart"/>
-      <w:r>
-        <w:t>informa;óes</w:t>
-      </w:r>
-      <w:proofErr w:type="spellEnd"/>
-      <w:r>
-        <w:t xml:space="preserve"> </w:t>
+        <w:t xml:space="preserve">Na funcionalidade produtos – Servi;os – quando editar trazer as informa;óes </w:t>
       </w:r>
     </w:p>
     <w:p>
@@ -54,36 +30,15 @@
         <w:t xml:space="preserve">3-) </w:t>
       </w:r>
       <w:r>
-        <w:t xml:space="preserve">Na funcionalidade pipeline – quando editar a oportunidade trazer as </w:t>
-      </w:r>
-      <w:proofErr w:type="spellStart"/>
-      <w:r>
-        <w:t>informa;óes</w:t>
-      </w:r>
-      <w:proofErr w:type="spellEnd"/>
+        <w:t>Na funcionalidade pipeline – quando editar a oportunidade trazer as informa;óes</w:t>
+      </w:r>
     </w:p>
     <w:p>
       <w:r>
         <w:t>4- )</w:t>
       </w:r>
       <w:r>
-        <w:t xml:space="preserve">Na funcionalidade pipeline – permitir </w:t>
-      </w:r>
-      <w:proofErr w:type="spellStart"/>
-      <w:r>
-        <w:t>inclu;áo</w:t>
-      </w:r>
-      <w:proofErr w:type="spellEnd"/>
-      <w:r>
-        <w:t xml:space="preserve">  </w:t>
-      </w:r>
-      <w:proofErr w:type="spellStart"/>
-      <w:r>
-        <w:t>altera;áo</w:t>
-      </w:r>
-      <w:proofErr w:type="spellEnd"/>
-      <w:r>
-        <w:t xml:space="preserve"> e exclusão </w:t>
+        <w:t xml:space="preserve">Na funcionalidade pipeline – permitir inclu;áo  altera;áo e exclusão </w:t>
       </w:r>
     </w:p>
     <w:p>
@@ -137,6 +92,9 @@
       </w:r>
       <w:r>
         <w:t>Camserv@sfuf0sn8</w:t>
+      </w:r>
+      <w:r>
+        <w:t xml:space="preserve"> mudou para teste123</w:t>
       </w:r>
     </w:p>
     <w:p/>

</xml_diff>